<commit_message>
Update Results doc to SDT framing and H1/H2/H3/P1 numbering
- Add SDT lens to Results intro and hypothesis statements
- Renumber hypotheses to match outline: H1, H2 (direct), H3 (mediation), P1 (configurations)
- Add Hypothesis-mapping column to structural path table
- Fix AVE label (convergent validity, not reliability)
- Update path diagram figure labels (H1/H2/H3)
- Reference P1 explicitly in fsQCA sufficiency conclusion
- Refresh ZIP bundle
</commit_message>
<xml_diff>
--- a/analysis/outputs/Results_Section_JMIS.docx
+++ b/analysis/outputs/Results_Section_JMIS.docx
@@ -27,7 +27,21 @@
           <w:i w:val="0"/>
           <w:sz w:val="24"/>
         </w:rPr>
-        <w:t>This section reports the empirical results of the two-stage analytical strategy outlined in Section 3. Following recent methodological guidance in the IS literature, we combine a symmetric, variance-based structural equation model (PLS-SEM) with an asymmetric, set-theoretic analysis (fuzzy-set Qualitative Comparative Analysis, fsQCA). PLS-SEM evaluates the net, average effects hypothesised among user engagement (UE), user experience (UX), brand satisfaction (BSAT) and brand success / continuance (BSUC), whereas fsQCA examines whether particular configurations of these conditions are necessary or sufficient for high BSUC. All analyses were conducted on the full sample of N = 312 valid responses measured on seven-point Likert scales, with no missing data. The complete, reproducible analysis pipeline (data screening, calibration, estimation, and 5,000 bootstrap resamples) is available with the supplementary materials.</w:t>
+        <w:t>This section reports the empirical results of the two-stage analytical strategy outlined in Section 3. Grounded in Self-Determination Theory (SDT), the model treats user engagement (UE) and user experience (UX) as behavioural and perceptual manifestations of basic psychological need satisfaction in the avatar-mediated system (autonomy, competence, and relatedness), brand satisfaction (BSAT) as the resulting evaluative judgment, and brand success / continuance (BSUC) as the downstream brand-relevant outcome. Following recent methodological guidance in the IS literature, we combine a symmetric, variance-based structural equation model (PLS-SEM) with an asymmetric, set-theoretic analysis (fuzzy-set Qualitative Comparative Analysis, fsQCA). PLS-SEM evaluates the net, average effects hypothesised among UE, UX, BSAT, and BSUC, namely the direct effects of engagement and experience on brand success (H1, H2) and the mediation of these effects through brand satisfaction (H3), whereas fsQCA examines proposition P1, that multiple configurations of UE, UX, and BSAT are sufficient for high BSUC (equifinality). All analyses were conducted on the full sample of N = 312 valid responses measured on seven-point Likert scales, with no missing data. The complete, reproducible analysis pipeline (data screening, calibration, estimation, and 5,000 bootstrap resamples) is available with the supplementary materials.</w:t>
+      </w:r>
+    </w:p>
+    <w:p>
+      <w:pPr>
+        <w:jc w:val="both"/>
+      </w:pPr>
+      <w:r>
+        <w:rPr>
+          <w:rFonts w:ascii="Times New Roman" w:hAnsi="Times New Roman" w:eastAsia="Times New Roman"/>
+          <w:b w:val="0"/>
+          <w:i w:val="0"/>
+          <w:sz w:val="24"/>
+        </w:rPr>
+        <w:t>For clarity, the hypotheses tested are: H1, UE → BSUC (direct); H2, UX → BSUC (direct); H3, UE and UX → BSAT → BSUC (brand satisfaction mediates the effects of engagement and experience on brand success); and P1, multiple configurations of {UE, UX, BSAT} are sufficient for high BSUC. Within the SDT lens, H1–H3 predict that fuller satisfaction of users’ psychological needs (expressed as higher UE and UX) translates into more favourable brand evaluations and, ultimately, greater brand success, while P1 allows for equifinality, that is, several distinct need-satisfaction profiles reaching the same outcome.</w:t>
       </w:r>
     </w:p>
     <w:p>
@@ -750,7 +764,7 @@
           <w:i/>
           <w:sz w:val="20"/>
         </w:rPr>
-        <w:t>Note. CR = composite reliability; AVE = average variance extracted. Thresholds: α and CR ≥ 0.70; AVE ≥ 0.50.</w:t>
+        <w:t>Note. CR = composite reliability; AVE = average variance extracted, which indexes convergent validity (not reliability). Thresholds: α and CR ≥ 0.70; AVE ≥ 0.50.</w:t>
       </w:r>
     </w:p>
     <w:p/>
@@ -3203,7 +3217,7 @@
           <w:i w:val="0"/>
           <w:sz w:val="24"/>
         </w:rPr>
-        <w:t>Table 5 and Figure 1 summarise the structural estimates. Contrary to expectations, none of the hypothesised paths reached statistical significance at the 0.05 level. Specifically, the effects of UE and UX on BSAT (H3a, H3b), of UE and UX on BSUC (H1, H2), and of BSAT on BSUC (H4) were all statistically non-significant, with bootstrap 95% confidence intervals that straddled zero in every case. The standardised path coefficients were uniformly small in magnitude (|β| ≤ 0.103).</w:t>
+        <w:t>Table 5 and Figure 1 summarise the structural estimates. Contrary to expectations, none of the hypothesised relationships reached statistical significance at the 0.05 level. Specifically, the direct effects of UE and UX on BSUC (H1, H2) and all three legs of the hypothesised mediation chain (UE → BSAT, UX → BSAT, and BSAT → BSUC, which jointly constitute H3) were statistically non-significant, with bootstrap 95% confidence intervals that straddled zero in every case. The standardised path coefficients were uniformly small in magnitude (|β| ≤ 0.103). Under the SDT lens, this implies that, in the present sample, variation in need-satisfaction indicators (UE, UX) did not translate into variation in brand evaluation (BSAT) or brand success (BSUC).</w:t>
       </w:r>
     </w:p>
     <w:p>
@@ -3228,19 +3242,20 @@
         <w:tblLook w:firstColumn="1" w:firstRow="1" w:lastColumn="0" w:lastRow="0" w:noHBand="0" w:noVBand="1" w:val="04A0"/>
       </w:tblPr>
       <w:tblGrid>
-        <w:gridCol w:w="1080"/>
-        <w:gridCol w:w="1080"/>
-        <w:gridCol w:w="1080"/>
-        <w:gridCol w:w="1080"/>
-        <w:gridCol w:w="1080"/>
-        <w:gridCol w:w="1080"/>
-        <w:gridCol w:w="1080"/>
-        <w:gridCol w:w="1080"/>
+        <w:gridCol w:w="960"/>
+        <w:gridCol w:w="960"/>
+        <w:gridCol w:w="960"/>
+        <w:gridCol w:w="960"/>
+        <w:gridCol w:w="960"/>
+        <w:gridCol w:w="960"/>
+        <w:gridCol w:w="960"/>
+        <w:gridCol w:w="960"/>
+        <w:gridCol w:w="960"/>
       </w:tblGrid>
       <w:tr>
         <w:tc>
           <w:tcPr>
-            <w:tcW w:type="dxa" w:w="1080"/>
+            <w:tcW w:type="dxa" w:w="960"/>
           </w:tcPr>
           <w:p>
             <w:r/>
@@ -3257,7 +3272,27 @@
         </w:tc>
         <w:tc>
           <w:tcPr>
-            <w:tcW w:type="dxa" w:w="1080"/>
+            <w:tcW w:type="dxa" w:w="960"/>
+          </w:tcPr>
+          <w:p>
+            <w:pPr>
+              <w:jc w:val="center"/>
+            </w:pPr>
+            <w:r/>
+            <w:r>
+              <w:rPr>
+                <w:rFonts w:ascii="Times New Roman" w:hAnsi="Times New Roman" w:eastAsia="Times New Roman"/>
+                <w:b/>
+                <w:i w:val="0"/>
+                <w:sz w:val="22"/>
+              </w:rPr>
+              <w:t>Hyp.</w:t>
+            </w:r>
+          </w:p>
+        </w:tc>
+        <w:tc>
+          <w:tcPr>
+            <w:tcW w:type="dxa" w:w="960"/>
           </w:tcPr>
           <w:p>
             <w:pPr>
@@ -3277,7 +3312,7 @@
         </w:tc>
         <w:tc>
           <w:tcPr>
-            <w:tcW w:type="dxa" w:w="1080"/>
+            <w:tcW w:type="dxa" w:w="960"/>
           </w:tcPr>
           <w:p>
             <w:pPr>
@@ -3297,7 +3332,7 @@
         </w:tc>
         <w:tc>
           <w:tcPr>
-            <w:tcW w:type="dxa" w:w="1080"/>
+            <w:tcW w:type="dxa" w:w="960"/>
           </w:tcPr>
           <w:p>
             <w:pPr>
@@ -3317,7 +3352,7 @@
         </w:tc>
         <w:tc>
           <w:tcPr>
-            <w:tcW w:type="dxa" w:w="1080"/>
+            <w:tcW w:type="dxa" w:w="960"/>
           </w:tcPr>
           <w:p>
             <w:pPr>
@@ -3337,7 +3372,7 @@
         </w:tc>
         <w:tc>
           <w:tcPr>
-            <w:tcW w:type="dxa" w:w="1080"/>
+            <w:tcW w:type="dxa" w:w="960"/>
           </w:tcPr>
           <w:p>
             <w:pPr>
@@ -3357,7 +3392,7 @@
         </w:tc>
         <w:tc>
           <w:tcPr>
-            <w:tcW w:type="dxa" w:w="1080"/>
+            <w:tcW w:type="dxa" w:w="960"/>
           </w:tcPr>
           <w:p>
             <w:pPr>
@@ -3377,7 +3412,7 @@
         </w:tc>
         <w:tc>
           <w:tcPr>
-            <w:tcW w:type="dxa" w:w="1080"/>
+            <w:tcW w:type="dxa" w:w="960"/>
           </w:tcPr>
           <w:p>
             <w:pPr>
@@ -3399,7 +3434,7 @@
       <w:tr>
         <w:tc>
           <w:tcPr>
-            <w:tcW w:type="dxa" w:w="1080"/>
+            <w:tcW w:type="dxa" w:w="960"/>
           </w:tcPr>
           <w:p>
             <w:r>
@@ -3415,7 +3450,27 @@
         </w:tc>
         <w:tc>
           <w:tcPr>
-            <w:tcW w:type="dxa" w:w="1080"/>
+            <w:tcW w:type="dxa" w:w="960"/>
+          </w:tcPr>
+          <w:p>
+            <w:pPr>
+              <w:jc w:val="center"/>
+            </w:pPr>
+            <w:r/>
+            <w:r>
+              <w:rPr>
+                <w:rFonts w:ascii="Times New Roman" w:hAnsi="Times New Roman" w:eastAsia="Times New Roman"/>
+                <w:b w:val="0"/>
+                <w:i w:val="0"/>
+                <w:sz w:val="22"/>
+              </w:rPr>
+              <w:t>H3 (a1)</w:t>
+            </w:r>
+          </w:p>
+        </w:tc>
+        <w:tc>
+          <w:tcPr>
+            <w:tcW w:type="dxa" w:w="960"/>
           </w:tcPr>
           <w:p>
             <w:pPr>
@@ -3435,7 +3490,7 @@
         </w:tc>
         <w:tc>
           <w:tcPr>
-            <w:tcW w:type="dxa" w:w="1080"/>
+            <w:tcW w:type="dxa" w:w="960"/>
           </w:tcPr>
           <w:p>
             <w:pPr>
@@ -3455,7 +3510,7 @@
         </w:tc>
         <w:tc>
           <w:tcPr>
-            <w:tcW w:type="dxa" w:w="1080"/>
+            <w:tcW w:type="dxa" w:w="960"/>
           </w:tcPr>
           <w:p>
             <w:pPr>
@@ -3475,7 +3530,7 @@
         </w:tc>
         <w:tc>
           <w:tcPr>
-            <w:tcW w:type="dxa" w:w="1080"/>
+            <w:tcW w:type="dxa" w:w="960"/>
           </w:tcPr>
           <w:p>
             <w:pPr>
@@ -3495,7 +3550,7 @@
         </w:tc>
         <w:tc>
           <w:tcPr>
-            <w:tcW w:type="dxa" w:w="1080"/>
+            <w:tcW w:type="dxa" w:w="960"/>
           </w:tcPr>
           <w:p>
             <w:pPr>
@@ -3515,7 +3570,7 @@
         </w:tc>
         <w:tc>
           <w:tcPr>
-            <w:tcW w:type="dxa" w:w="1080"/>
+            <w:tcW w:type="dxa" w:w="960"/>
           </w:tcPr>
           <w:p>
             <w:pPr>
@@ -3535,7 +3590,7 @@
         </w:tc>
         <w:tc>
           <w:tcPr>
-            <w:tcW w:type="dxa" w:w="1080"/>
+            <w:tcW w:type="dxa" w:w="960"/>
           </w:tcPr>
           <w:p>
             <w:pPr>
@@ -3557,7 +3612,7 @@
       <w:tr>
         <w:tc>
           <w:tcPr>
-            <w:tcW w:type="dxa" w:w="1080"/>
+            <w:tcW w:type="dxa" w:w="960"/>
           </w:tcPr>
           <w:p>
             <w:r>
@@ -3573,7 +3628,27 @@
         </w:tc>
         <w:tc>
           <w:tcPr>
-            <w:tcW w:type="dxa" w:w="1080"/>
+            <w:tcW w:type="dxa" w:w="960"/>
+          </w:tcPr>
+          <w:p>
+            <w:pPr>
+              <w:jc w:val="center"/>
+            </w:pPr>
+            <w:r/>
+            <w:r>
+              <w:rPr>
+                <w:rFonts w:ascii="Times New Roman" w:hAnsi="Times New Roman" w:eastAsia="Times New Roman"/>
+                <w:b w:val="0"/>
+                <w:i w:val="0"/>
+                <w:sz w:val="22"/>
+              </w:rPr>
+              <w:t>H3 (a2)</w:t>
+            </w:r>
+          </w:p>
+        </w:tc>
+        <w:tc>
+          <w:tcPr>
+            <w:tcW w:type="dxa" w:w="960"/>
           </w:tcPr>
           <w:p>
             <w:pPr>
@@ -3593,7 +3668,7 @@
         </w:tc>
         <w:tc>
           <w:tcPr>
-            <w:tcW w:type="dxa" w:w="1080"/>
+            <w:tcW w:type="dxa" w:w="960"/>
           </w:tcPr>
           <w:p>
             <w:pPr>
@@ -3613,7 +3688,7 @@
         </w:tc>
         <w:tc>
           <w:tcPr>
-            <w:tcW w:type="dxa" w:w="1080"/>
+            <w:tcW w:type="dxa" w:w="960"/>
           </w:tcPr>
           <w:p>
             <w:pPr>
@@ -3633,7 +3708,7 @@
         </w:tc>
         <w:tc>
           <w:tcPr>
-            <w:tcW w:type="dxa" w:w="1080"/>
+            <w:tcW w:type="dxa" w:w="960"/>
           </w:tcPr>
           <w:p>
             <w:pPr>
@@ -3653,7 +3728,7 @@
         </w:tc>
         <w:tc>
           <w:tcPr>
-            <w:tcW w:type="dxa" w:w="1080"/>
+            <w:tcW w:type="dxa" w:w="960"/>
           </w:tcPr>
           <w:p>
             <w:pPr>
@@ -3673,7 +3748,7 @@
         </w:tc>
         <w:tc>
           <w:tcPr>
-            <w:tcW w:type="dxa" w:w="1080"/>
+            <w:tcW w:type="dxa" w:w="960"/>
           </w:tcPr>
           <w:p>
             <w:pPr>
@@ -3693,7 +3768,7 @@
         </w:tc>
         <w:tc>
           <w:tcPr>
-            <w:tcW w:type="dxa" w:w="1080"/>
+            <w:tcW w:type="dxa" w:w="960"/>
           </w:tcPr>
           <w:p>
             <w:pPr>
@@ -3715,7 +3790,7 @@
       <w:tr>
         <w:tc>
           <w:tcPr>
-            <w:tcW w:type="dxa" w:w="1080"/>
+            <w:tcW w:type="dxa" w:w="960"/>
           </w:tcPr>
           <w:p>
             <w:r>
@@ -3731,7 +3806,27 @@
         </w:tc>
         <w:tc>
           <w:tcPr>
-            <w:tcW w:type="dxa" w:w="1080"/>
+            <w:tcW w:type="dxa" w:w="960"/>
+          </w:tcPr>
+          <w:p>
+            <w:pPr>
+              <w:jc w:val="center"/>
+            </w:pPr>
+            <w:r/>
+            <w:r>
+              <w:rPr>
+                <w:rFonts w:ascii="Times New Roman" w:hAnsi="Times New Roman" w:eastAsia="Times New Roman"/>
+                <w:b w:val="0"/>
+                <w:i w:val="0"/>
+                <w:sz w:val="22"/>
+              </w:rPr>
+              <w:t>H1</w:t>
+            </w:r>
+          </w:p>
+        </w:tc>
+        <w:tc>
+          <w:tcPr>
+            <w:tcW w:type="dxa" w:w="960"/>
           </w:tcPr>
           <w:p>
             <w:pPr>
@@ -3751,7 +3846,7 @@
         </w:tc>
         <w:tc>
           <w:tcPr>
-            <w:tcW w:type="dxa" w:w="1080"/>
+            <w:tcW w:type="dxa" w:w="960"/>
           </w:tcPr>
           <w:p>
             <w:pPr>
@@ -3771,7 +3866,7 @@
         </w:tc>
         <w:tc>
           <w:tcPr>
-            <w:tcW w:type="dxa" w:w="1080"/>
+            <w:tcW w:type="dxa" w:w="960"/>
           </w:tcPr>
           <w:p>
             <w:pPr>
@@ -3791,7 +3886,7 @@
         </w:tc>
         <w:tc>
           <w:tcPr>
-            <w:tcW w:type="dxa" w:w="1080"/>
+            <w:tcW w:type="dxa" w:w="960"/>
           </w:tcPr>
           <w:p>
             <w:pPr>
@@ -3811,7 +3906,7 @@
         </w:tc>
         <w:tc>
           <w:tcPr>
-            <w:tcW w:type="dxa" w:w="1080"/>
+            <w:tcW w:type="dxa" w:w="960"/>
           </w:tcPr>
           <w:p>
             <w:pPr>
@@ -3831,7 +3926,7 @@
         </w:tc>
         <w:tc>
           <w:tcPr>
-            <w:tcW w:type="dxa" w:w="1080"/>
+            <w:tcW w:type="dxa" w:w="960"/>
           </w:tcPr>
           <w:p>
             <w:pPr>
@@ -3851,7 +3946,7 @@
         </w:tc>
         <w:tc>
           <w:tcPr>
-            <w:tcW w:type="dxa" w:w="1080"/>
+            <w:tcW w:type="dxa" w:w="960"/>
           </w:tcPr>
           <w:p>
             <w:pPr>
@@ -3873,7 +3968,7 @@
       <w:tr>
         <w:tc>
           <w:tcPr>
-            <w:tcW w:type="dxa" w:w="1080"/>
+            <w:tcW w:type="dxa" w:w="960"/>
           </w:tcPr>
           <w:p>
             <w:r>
@@ -3889,7 +3984,27 @@
         </w:tc>
         <w:tc>
           <w:tcPr>
-            <w:tcW w:type="dxa" w:w="1080"/>
+            <w:tcW w:type="dxa" w:w="960"/>
+          </w:tcPr>
+          <w:p>
+            <w:pPr>
+              <w:jc w:val="center"/>
+            </w:pPr>
+            <w:r/>
+            <w:r>
+              <w:rPr>
+                <w:rFonts w:ascii="Times New Roman" w:hAnsi="Times New Roman" w:eastAsia="Times New Roman"/>
+                <w:b w:val="0"/>
+                <w:i w:val="0"/>
+                <w:sz w:val="22"/>
+              </w:rPr>
+              <w:t>H2</w:t>
+            </w:r>
+          </w:p>
+        </w:tc>
+        <w:tc>
+          <w:tcPr>
+            <w:tcW w:type="dxa" w:w="960"/>
           </w:tcPr>
           <w:p>
             <w:pPr>
@@ -3909,7 +4024,7 @@
         </w:tc>
         <w:tc>
           <w:tcPr>
-            <w:tcW w:type="dxa" w:w="1080"/>
+            <w:tcW w:type="dxa" w:w="960"/>
           </w:tcPr>
           <w:p>
             <w:pPr>
@@ -3929,7 +4044,7 @@
         </w:tc>
         <w:tc>
           <w:tcPr>
-            <w:tcW w:type="dxa" w:w="1080"/>
+            <w:tcW w:type="dxa" w:w="960"/>
           </w:tcPr>
           <w:p>
             <w:pPr>
@@ -3949,7 +4064,7 @@
         </w:tc>
         <w:tc>
           <w:tcPr>
-            <w:tcW w:type="dxa" w:w="1080"/>
+            <w:tcW w:type="dxa" w:w="960"/>
           </w:tcPr>
           <w:p>
             <w:pPr>
@@ -3969,7 +4084,7 @@
         </w:tc>
         <w:tc>
           <w:tcPr>
-            <w:tcW w:type="dxa" w:w="1080"/>
+            <w:tcW w:type="dxa" w:w="960"/>
           </w:tcPr>
           <w:p>
             <w:pPr>
@@ -3989,7 +4104,7 @@
         </w:tc>
         <w:tc>
           <w:tcPr>
-            <w:tcW w:type="dxa" w:w="1080"/>
+            <w:tcW w:type="dxa" w:w="960"/>
           </w:tcPr>
           <w:p>
             <w:pPr>
@@ -4009,7 +4124,7 @@
         </w:tc>
         <w:tc>
           <w:tcPr>
-            <w:tcW w:type="dxa" w:w="1080"/>
+            <w:tcW w:type="dxa" w:w="960"/>
           </w:tcPr>
           <w:p>
             <w:pPr>
@@ -4031,7 +4146,7 @@
       <w:tr>
         <w:tc>
           <w:tcPr>
-            <w:tcW w:type="dxa" w:w="1080"/>
+            <w:tcW w:type="dxa" w:w="960"/>
           </w:tcPr>
           <w:p>
             <w:r>
@@ -4047,7 +4162,27 @@
         </w:tc>
         <w:tc>
           <w:tcPr>
-            <w:tcW w:type="dxa" w:w="1080"/>
+            <w:tcW w:type="dxa" w:w="960"/>
+          </w:tcPr>
+          <w:p>
+            <w:pPr>
+              <w:jc w:val="center"/>
+            </w:pPr>
+            <w:r/>
+            <w:r>
+              <w:rPr>
+                <w:rFonts w:ascii="Times New Roman" w:hAnsi="Times New Roman" w:eastAsia="Times New Roman"/>
+                <w:b w:val="0"/>
+                <w:i w:val="0"/>
+                <w:sz w:val="22"/>
+              </w:rPr>
+              <w:t>H3 (b)</w:t>
+            </w:r>
+          </w:p>
+        </w:tc>
+        <w:tc>
+          <w:tcPr>
+            <w:tcW w:type="dxa" w:w="960"/>
           </w:tcPr>
           <w:p>
             <w:pPr>
@@ -4067,7 +4202,7 @@
         </w:tc>
         <w:tc>
           <w:tcPr>
-            <w:tcW w:type="dxa" w:w="1080"/>
+            <w:tcW w:type="dxa" w:w="960"/>
           </w:tcPr>
           <w:p>
             <w:pPr>
@@ -4087,7 +4222,7 @@
         </w:tc>
         <w:tc>
           <w:tcPr>
-            <w:tcW w:type="dxa" w:w="1080"/>
+            <w:tcW w:type="dxa" w:w="960"/>
           </w:tcPr>
           <w:p>
             <w:pPr>
@@ -4107,7 +4242,7 @@
         </w:tc>
         <w:tc>
           <w:tcPr>
-            <w:tcW w:type="dxa" w:w="1080"/>
+            <w:tcW w:type="dxa" w:w="960"/>
           </w:tcPr>
           <w:p>
             <w:pPr>
@@ -4127,7 +4262,7 @@
         </w:tc>
         <w:tc>
           <w:tcPr>
-            <w:tcW w:type="dxa" w:w="1080"/>
+            <w:tcW w:type="dxa" w:w="960"/>
           </w:tcPr>
           <w:p>
             <w:pPr>
@@ -4147,7 +4282,7 @@
         </w:tc>
         <w:tc>
           <w:tcPr>
-            <w:tcW w:type="dxa" w:w="1080"/>
+            <w:tcW w:type="dxa" w:w="960"/>
           </w:tcPr>
           <w:p>
             <w:pPr>
@@ -4167,7 +4302,7 @@
         </w:tc>
         <w:tc>
           <w:tcPr>
-            <w:tcW w:type="dxa" w:w="1080"/>
+            <w:tcW w:type="dxa" w:w="960"/>
           </w:tcPr>
           <w:p>
             <w:pPr>
@@ -4841,7 +4976,7 @@
           <w:i w:val="0"/>
           <w:sz w:val="24"/>
         </w:rPr>
-        <w:t>We further tested the indirect (mediated) effects of UE and UX on BSUC through BSAT using the bootstrap distribution of the product of path coefficients. As shown in Table 8, neither indirect effect was statistically significant (UE → BSAT → BSUC: effect = -0.0013, p = 0.835; UX → BSAT → BSUC: effect = 0.0029, p = 0.731). Because the constituent direct paths were themselves non-significant, no mediation through brand satisfaction was supported.</w:t>
+        <w:t>Hypothesis H3 posits that brand satisfaction mediates the effects of UE and UX on BSUC. We tested the indirect (mediated) effects using the bootstrap distribution of the product of path coefficients. As shown in Table 8, neither indirect effect was statistically significant (UE → BSAT → BSUC: effect = -0.0013, p = 0.835; UX → BSAT → BSUC: effect = 0.0029, p = 0.731). Because the constituent direct paths were themselves non-significant, H3 is not supported and no mediation through brand satisfaction is evidenced.</w:t>
       </w:r>
     </w:p>
     <w:p>
@@ -6429,7 +6564,7 @@
           <w:i w:val="0"/>
           <w:sz w:val="24"/>
         </w:rPr>
-        <w:t>Next, we constructed the truth table of all 2³ = 8 possible configurations of the three conditions and evaluated their sufficiency for high BSUC, applying conventional thresholds of a minimum frequency of three cases and a minimum raw consistency of 0.80. As shown in Table 11 and Figure 8, although all eight configurations were well populated, the highest raw consistency attained by any configuration was only 0.739, below the 0.80 sufficiency cut-off. Consequently, no configuration qualified as a sufficient condition for high BSUC, and the sufficiency solution is empty (solution coverage and consistency are undefined). In other words, no combination of high or low UE, UX, and BSAT reliably produces high brand success.</w:t>
+        <w:t>Next, we constructed the truth table of all 2³ = 8 possible configurations of the three conditions and evaluated their sufficiency for high BSUC, applying conventional thresholds of a minimum frequency of three cases and a minimum raw consistency of 0.80. As shown in Table 11 and Figure 8, although all eight configurations were well populated, the highest raw consistency attained by any configuration was only 0.739, below the 0.80 sufficiency cut-off. Consequently, no configuration qualified as a sufficient condition for high BSUC, and the sufficiency solution is empty (solution coverage and consistency are undefined). Proposition P1 is therefore not supported: no combination of high or low UE, UX, and BSAT reliably produces high brand success, and there is no evidence of equifinality in this sample.</w:t>
       </w:r>
     </w:p>
     <w:p>
@@ -7153,7 +7288,7 @@
                 <w:i w:val="0"/>
                 <w:sz w:val="22"/>
               </w:rPr>
-              <w:t>H1: UE → BSUC</w:t>
+              <w:t>H1: UE → BSUC (direct)</w:t>
             </w:r>
           </w:p>
         </w:tc>
@@ -7191,7 +7326,7 @@
                 <w:i w:val="0"/>
                 <w:sz w:val="22"/>
               </w:rPr>
-              <w:t>H2: UX → BSUC</w:t>
+              <w:t>H2: UX → BSUC (direct)</w:t>
             </w:r>
           </w:p>
         </w:tc>
@@ -7229,7 +7364,7 @@
                 <w:i w:val="0"/>
                 <w:sz w:val="22"/>
               </w:rPr>
-              <w:t>H3a: UE → BSAT</w:t>
+              <w:t>H3: UE and UX → BSAT → BSUC (BSAT mediates)</w:t>
             </w:r>
           </w:p>
         </w:tc>
@@ -7267,121 +7402,7 @@
                 <w:i w:val="0"/>
                 <w:sz w:val="22"/>
               </w:rPr>
-              <w:t>H3b: UX → BSAT</w:t>
-            </w:r>
-          </w:p>
-        </w:tc>
-        <w:tc>
-          <w:tcPr>
-            <w:tcW w:type="dxa" w:w="4320"/>
-          </w:tcPr>
-          <w:p>
-            <w:pPr>
-              <w:jc w:val="center"/>
-            </w:pPr>
-            <w:r/>
-            <w:r>
-              <w:rPr>
-                <w:rFonts w:ascii="Times New Roman" w:hAnsi="Times New Roman" w:eastAsia="Times New Roman"/>
-                <w:b w:val="0"/>
-                <w:i w:val="0"/>
-                <w:sz w:val="22"/>
-              </w:rPr>
-              <w:t>Not supported</w:t>
-            </w:r>
-          </w:p>
-        </w:tc>
-      </w:tr>
-      <w:tr>
-        <w:tc>
-          <w:tcPr>
-            <w:tcW w:type="dxa" w:w="4320"/>
-          </w:tcPr>
-          <w:p>
-            <w:r>
-              <w:rPr>
-                <w:rFonts w:ascii="Times New Roman" w:hAnsi="Times New Roman" w:eastAsia="Times New Roman"/>
-                <w:b w:val="0"/>
-                <w:i w:val="0"/>
-                <w:sz w:val="22"/>
-              </w:rPr>
-              <w:t>H4: BSAT → BSUC</w:t>
-            </w:r>
-          </w:p>
-        </w:tc>
-        <w:tc>
-          <w:tcPr>
-            <w:tcW w:type="dxa" w:w="4320"/>
-          </w:tcPr>
-          <w:p>
-            <w:pPr>
-              <w:jc w:val="center"/>
-            </w:pPr>
-            <w:r/>
-            <w:r>
-              <w:rPr>
-                <w:rFonts w:ascii="Times New Roman" w:hAnsi="Times New Roman" w:eastAsia="Times New Roman"/>
-                <w:b w:val="0"/>
-                <w:i w:val="0"/>
-                <w:sz w:val="22"/>
-              </w:rPr>
-              <w:t>Not supported</w:t>
-            </w:r>
-          </w:p>
-        </w:tc>
-      </w:tr>
-      <w:tr>
-        <w:tc>
-          <w:tcPr>
-            <w:tcW w:type="dxa" w:w="4320"/>
-          </w:tcPr>
-          <w:p>
-            <w:r>
-              <w:rPr>
-                <w:rFonts w:ascii="Times New Roman" w:hAnsi="Times New Roman" w:eastAsia="Times New Roman"/>
-                <w:b w:val="0"/>
-                <w:i w:val="0"/>
-                <w:sz w:val="22"/>
-              </w:rPr>
-              <w:t>Mediation: UE/UX → BSAT → BSUC</w:t>
-            </w:r>
-          </w:p>
-        </w:tc>
-        <w:tc>
-          <w:tcPr>
-            <w:tcW w:type="dxa" w:w="4320"/>
-          </w:tcPr>
-          <w:p>
-            <w:pPr>
-              <w:jc w:val="center"/>
-            </w:pPr>
-            <w:r/>
-            <w:r>
-              <w:rPr>
-                <w:rFonts w:ascii="Times New Roman" w:hAnsi="Times New Roman" w:eastAsia="Times New Roman"/>
-                <w:b w:val="0"/>
-                <w:i w:val="0"/>
-                <w:sz w:val="22"/>
-              </w:rPr>
-              <w:t>Not supported</w:t>
-            </w:r>
-          </w:p>
-        </w:tc>
-      </w:tr>
-      <w:tr>
-        <w:tc>
-          <w:tcPr>
-            <w:tcW w:type="dxa" w:w="4320"/>
-          </w:tcPr>
-          <w:p>
-            <w:r>
-              <w:rPr>
-                <w:rFonts w:ascii="Times New Roman" w:hAnsi="Times New Roman" w:eastAsia="Times New Roman"/>
-                <w:b w:val="0"/>
-                <w:i w:val="0"/>
-                <w:sz w:val="22"/>
-              </w:rPr>
-              <w:t>P1: Sufficient configurations for high BSUC</w:t>
+              <w:t>P1: Multiple configurations of {UE, UX, BSAT} sufficient for high BSUC</w:t>
             </w:r>
           </w:p>
         </w:tc>

</xml_diff>